<commit_message>
hoan thien table phu luc han muc
</commit_message>
<xml_diff>
--- a/src/main/resources/templates/BienBanXacDinhGiaTriTaiSanBaoDam.docx
+++ b/src/main/resources/templates/BienBanXacDinhGiaTriTaiSanBaoDam.docx
@@ -201,8 +201,10 @@
           <w:b/>
           <w:sz w:val="26"/>
         </w:rPr>
-        <w:t>{{shdvl}}</w:t>
-      </w:r>
+        <w:t>{{shdvlts}}</w:t>
+      </w:r>
+      <w:bookmarkStart w:id="0" w:name="_GoBack"/>
+      <w:bookmarkEnd w:id="0"/>
     </w:p>
     <w:p>
       <w:pPr>
@@ -1075,8 +1077,6 @@
         </w:rPr>
         <w:t>.</w:t>
       </w:r>
-      <w:bookmarkStart w:id="0" w:name="_GoBack"/>
-      <w:bookmarkEnd w:id="0"/>
     </w:p>
     <w:p>
       <w:pPr>

</xml_diff>